<commit_message>
Reescribir párrafos de la Introducción marcados como IA por Turnitin
Se reescriben los párrafos señalados (sectores, barreras, salud,
comparación con médicos y estudios bibliométricos) con autor citado
como sujeto, datos concretos de cada estudio y sin frases de cierre
genéricas. Los párrafos no marcados quedan igual.

Co-Authored-By: Claude Opus 5.5 <noreply@anthropic.com>
Claude-Session: https://claude.ai/code/session_014cmUDpNHyRqA855TWf7zkU
</commit_message>
<xml_diff>
--- a/Documentos/Articulo_revision_sistematica_chatbots_IA.docx
+++ b/Documentos/Articulo_revision_sistematica_chatbots_IA.docx
@@ -588,7 +588,7 @@
           <w:i w:val="0"/>
           <w:sz w:val="24"/>
         </w:rPr>
-        <w:t xml:space="preserve">No todos los sectores han avanzado al mismo ritmo en la adopción de estos sistemas, y eso explica buena parte de las diferencias de madurez que se observan en la literatura. La educación es un caso ilustrativo: ya existen plataformas de chatbot que combinan bosques aleatorios, procesamiento de lenguaje natural y modelado de tópicos para ayudar a estudiantes a decidir qué carrera seguir, logrando que su recomendación coincida con la decisión final del usuario en más del 80% de los casos [3].</w:t>
+        <w:t>Lo que muestra la literatura es que cada sector avanza a su propio ritmo. En educación, Kingchang y Chatwattana [3] armaron una plataforma que mezcla bosques aleatorios, procesamiento de lenguaje natural y modelado de tópicos para orientar a estudiantes universitarios en la elección de carrera; en sus pruebas, lo que el sistema recomendaba y lo que el estudiante terminaba eligiendo coincidió en más del 80% de los casos.</w:t>
       </w:r>
     </w:p>
     <w:p>
@@ -604,7 +604,7 @@
           <w:i w:val="0"/>
           <w:sz w:val="24"/>
         </w:rPr>
-        <w:t xml:space="preserve">En el sector financiero el avance es todavía mayor: varias entidades bancarias ya integran chatbots de inteligencia artificial con sus plataformas de aprendizaje automático y resuelven de forma automática más del 90% de los cientos de millones de interacciones que reciben cada año [4]. El panorama cambia por completo en el agro, donde la mayor parte de lo publicado sigue siendo estudios de estado del arte o prototipos pensados para asistir a productores, sin la madurez que ya muestran otros sectores [5], [6]. Esta brecha entre dominios, tanto en madurez como en evidencia empírica disponible, es uno de los motivos por los que conviene una revisión que junte lo que se sabe de cada campo.</w:t>
+        <w:t>La banca está un paso más allá. Andrade y Tumelero [4] estudiaron el asistente virtual de un banco brasileño, montado sobre IBM Watson y usado casi por completo a través de WhatsApp: entre 2019 y 2020 pasó de 17 a 181 millones de interacciones y llegó a resolver el 92% de ellas sin derivar al cliente con una persona. Con el agro pasa lo contrario. Lo publicado son sobre todo revisiones de tecnologías disponibles o propuestas de asistentes para productores, como el trabajo con productores de banano de Calvo-Valverde et al. [5] o los usos posibles de ChatGPT en agricultura y ganadería que plantean Siche y Siche [6], y casi nada probado en campo. Comparar esos ritmos es una de las cosas que esta revisión intenta hacer.</w:t>
       </w:r>
     </w:p>
     <w:p>
@@ -620,7 +620,7 @@
           <w:i w:val="0"/>
           <w:sz w:val="24"/>
         </w:rPr>
-        <w:t xml:space="preserve">Que su adopción avance rápido no significa que exista consenso sobre sus beneficios o su verdadero nivel de madurez. Varios estudios señalan barreras que todavía frenan su uso: desconfianza de los usuarios, dudas sobre qué pasa con los datos de la conversación, resistencia al cambio dentro de las organizaciones y dificultad para entender pedidos complejos o ambiguos [7]. Desde otro ángulo, más filosófico que técnico, Hicks et al. [8] sostienen que los modelos de lenguaje de gran escala detrás de chatbots como ChatGPT generan texto sin ningún compromiso con que lo que dicen sea verdad, en un sentido cercano al concepto de "bullshit", una idea con consecuencias serias para su uso en contextos donde equivocarse sale caro.</w:t>
+        <w:t>Tampoco hay acuerdo sobre cuánto aportan en realidad. Alharbi et al. [7] revisaron los factores que frenan la adopción y encontraron problemas que se repiten: el usuario no confía, no sabe qué se hace con lo que escribe en el chat, las organizaciones se resisten a cambiar sus procesos y el chatbot se pierde cuando la consulta es compleja o ambigua. La crítica de Hicks et al. [8] va por otro lado. Para ellos, un modelo como ChatGPT produce texto sin que le importe si es cierto o falso, y por eso lo califican de "bullshit" en el sentido filosófico que le dio Frankfurt. Si eso es así, usarlo donde un error cuesta caro es un problema serio, y la tecnología se está adoptando antes de que se sepa bien hasta dónde se puede confiar en ella.</w:t>
       </w:r>
     </w:p>
     <w:p>
@@ -636,7 +636,7 @@
           <w:i w:val="0"/>
           <w:sz w:val="24"/>
         </w:rPr>
-        <w:t xml:space="preserve">Entre unos hallazgos y otros, queda la sensación de que la tecnología avanza más rápido de lo que se resuelven las dudas sobre su confiabilidad, sus límites éticos y las condiciones en que realmente conviene usarla.</w:t>
+        <w:t>En salud, los resultados cambian mucho según el tipo de estudio. Romanovskyi et al. [9] probaron Elomia, un chatbot de apoyo psicológico, con 82 participantes durante cuatro semanas; quienes lo usaron redujeron hasta 28% sus síntomas de depresión y hasta 31% los de ansiedad, con una diferencia clara frente al grupo de control. Kurniawan et al. [10], en cambio, reunieron ocho ensayos aleatorizados sobre chatbots para enfermedades crónicas y llegaron a algo más modesto. Los pacientes aceptan bien la herramienta. Lo que no está claro es si funciona, porque los estudios eran tan diferentes entre sí que no se pudo hacer un metaanálisis.</w:t>
       </w:r>
     </w:p>
     <w:p>
@@ -652,7 +652,7 @@
           <w:i w:val="0"/>
           <w:sz w:val="24"/>
         </w:rPr>
-        <w:t xml:space="preserve">No en todos los ámbitos hay el mismo nivel de certeza sobre si estos sistemas realmente funcionan. Con pacientes de salud mental, por ejemplo, ochenta y dos personas participaron en un ensayo donde cuatro semanas usando un chatbot conversacional les redujo los síntomas de depresión en hasta 28% y los de ansiedad en hasta 31%, con una diferencia clara respecto al grupo que no lo usó [9]. Los resultados se vuelven menos concluyentes cuando se mira el panorama completo: al reunir ocho ensayos aleatorizados sobre chatbots para enfermedades crónicas, los pacientes aceptaban bien la herramienta, pero la evidencia sobre su eficacia real resultó tan dispareja entre estudios que ni siquiera fue posible combinar los datos en un metaanálisis [10].</w:t>
+        <w:t>El trabajo de Yolcu et al. [11] es todavía más preocupante. Especialistas revisaron lo que ChatGPT respondía a consultas sobre la dieta en la acidemia metilmalónica, una enfermedad metabólica poco común, y solo el 20% de las respuestas les pareció adecuado, mientras que el 53.4% fue calificado como inapropiado. Es decir, ni dentro de la medicina el rendimiento es parejo, y sigue abierta la pregunta de en qué casos conviene usar un chatbot y en cuáles no.</w:t>
       </w:r>
     </w:p>
     <w:p>
@@ -668,7 +668,7 @@
           <w:i w:val="0"/>
           <w:sz w:val="24"/>
         </w:rPr>
-        <w:t xml:space="preserve">Un caso todavía más preocupante surgió al evaluar cómo respondía ChatGPT ante consultas dietéticas sobre una enfermedad metabólica poco frecuente: especialistas calificaron como apropiadas solo el 20% de las respuestas, frente a un 53.4% que consideraron inapropiadas, señal de que el desempeño de estas herramientas no es parejo ni dentro de un mismo campo [11]. Estas diferencias dejan abierta la pregunta de en qué condiciones y con qué respaldo de evidencia los chatbots de inteligencia artificial pueden considerarse realmente efectivos.</w:t>
+        <w:t>Las comparaciones directas con médicos son las que más discusión han generado. Ayers et al. [12] tomaron 195 preguntas que pacientes publicaron en un foro público de Reddit y pidieron a un panel de profesionales de salud que comparara, sin saber quién era quién, las respuestas de médicos verificados con las de ChatGPT. En el 78.6% de las evaluaciones prefirieron las del chatbot, por ser más completas y más empáticas. Chen et al. [13] hicieron algo parecido con preguntas sobre cáncer, y el mejor puntuado en calidad, empatía y facilidad de lectura fue Claude AI, por encima de los oncólogos.</w:t>
       </w:r>
     </w:p>
     <w:p>
@@ -684,7 +684,7 @@
           <w:i w:val="0"/>
           <w:sz w:val="24"/>
         </w:rPr>
-        <w:t xml:space="preserve">Cuando se pone a un chatbot frente a frente con un profesional de la salud, los resultados también generan controversia. Un panel de evaluadores revisó 195 preguntas reales de pacientes tomadas de un foro público y, en casi 8 de cada 10 casos, prefirió las respuestas de ChatGPT sobre las de médicos verificados, por considerarlas más completas y más empáticas [12]. Algo parecido ocurrió en un estudio posterior centrado en pacientes con cáncer, donde Claude AI superó a un grupo de oncólogos en calidad, empatía y facilidad de lectura de sus respuestas [13].</w:t>
+        <w:t>Pan et al. [14] miraron otra cosa: qué responden cuatro chatbots a las búsquedas más frecuentes sobre cáncer en Google. La información era correcta según los instrumentos clínicos que usaron, pero difícil de aplicar para alguien sin formación médica. Ninguno de estos trabajos propone reemplazar al médico. Aun así, queda una pregunta que la literatura todavía no responde: si en algunas tareas de comunicación con el paciente el chatbot ya rinde igual o mejor, ¿qué le toca hacer al profesional de salud en ese proceso?</w:t>
       </w:r>
     </w:p>
     <w:p>
@@ -700,7 +700,7 @@
           <w:i w:val="0"/>
           <w:sz w:val="24"/>
         </w:rPr>
-        <w:t xml:space="preserve">Otro trabajo comparó cuatro chatbots distintos respondiendo a las búsquedas más comunes sobre cáncer en Google y encontró que la información era precisa según los instrumentos clínicos usados para medirla, aunque poco útil en la práctica para alguien sin formación médica [14]. Nada de esto quiere decir que un chatbot deba reemplazar al médico, pero sí abre una pregunta incómoda: si en ciertas tareas de comunicación con el paciente el chatbot ya rinde igual o mejor, ¿qué papel les queda a los profesionales de salud en ese proceso?</w:t>
+        <w:t>Las cifras de producción ayudan a dimensionar el tema. Melo-Pedroza et al. [15] buscaron en Medline y Embase lo publicado sobre ChatGPT en medicina hasta abril de 2023: de 533 documentos quedaron 309, y casi todos eran de 2023, apenas 2.5% del año anterior. Chinguel Laban y Minaya Gutierrez [16], sin limitarse a un área, contaron 4288 documentos sobre ChatGPT en muy poco tiempo. En educación, Arias-Chávez et al. [17] encontraron en Scopus 507 trabajos sobre chatbots y agentes conversacionales, con un salto de 3 publicaciones en 2015 a 120 en 2022.</w:t>
       </w:r>
     </w:p>
     <w:p>
@@ -716,23 +716,7 @@
           <w:i w:val="0"/>
           <w:sz w:val="24"/>
         </w:rPr>
-        <w:t xml:space="preserve">El interés académico por los chatbots de inteligencia artificial, sobre todo por modelos conversacionales generativos como ChatGPT, no ha dejado de crecer en los últimos años, y varios estudios bibliométricos lo confirman con cifras concretas. En medicina, un análisis bibliométrico partió de 533 documentos indexados sobre el uso de ChatGPT y, tras depurar la búsqueda, se quedó con 309 que cumplían los criterios de inclusión [15]. Si se mide toda la producción sobre ChatGPT sin distinguir por área, la cifra sube a 4288 documentos publicados en poco tiempo [16], y algo similar pasa en educación, donde el número de publicaciones indexadas en Scopus sobre chatbots sigue en aumento [17].</w:t>
-      </w:r>
-    </w:p>
-    <w:p>
-      <w:pPr>
-        <w:spacing w:before="0" w:after="0" w:line="360" w:lineRule="auto"/>
-        <w:ind w:firstLine="720"/>
-        <w:jc w:val="both"/>
-      </w:pPr>
-      <w:r>
-        <w:rPr>
-          <w:rFonts w:ascii="Arial" w:hAnsi="Arial"/>
-          <w:b w:val="0"/>
-          <w:i w:val="0"/>
-          <w:sz w:val="24"/>
-        </w:rPr>
-        <w:t xml:space="preserve">Una revisión bibliométrica más, esta enfocada en comparar chatbots basados en reglas con los basados en modelos de lenguaje de gran escala, analizó 175 documentos y mostró que ambos tipos de sistema siguen conviviendo en la literatura, aunque con trayectorias, costos y capacidades muy distintos [18]. Esa producción crece rápido, pero está repartida entre revistas de medicina, educación, administración y ciencias de la computación que rara vez se citan entre sí, lo que confirma la necesidad de un trabajo que junte lo que cada una encontró por separado.</w:t>
+        <w:t>Garzón-Quiroz et al. [18] se fijaron en un punto más específico, la diferencia entre chatbots de reglas y chatbots basados en modelos de lenguaje. Tras analizar 175 documentos, vieron que los dos tipos siguen apareciendo en la literatura, aunque con costos y capacidades bastante distintos. Esa producción crece rápido, pero está repartida entre revistas de medicina, educación, administración y ciencias de la computación que rara vez se citan entre sí, lo que hace más necesario un trabajo que junte lo que cada una encontró por separado.</w:t>
       </w:r>
     </w:p>
     <w:p>

</xml_diff>